<commit_message>
docs: log the "View details and documents" session in the technical diary
Co-Authored-By: Claude Sonnet 5 <noreply@anthropic.com>
</commit_message>
<xml_diff>
--- a/Diario_de_Decisiones_Tecnicas_e_IA.docx
+++ b/Diario_de_Decisiones_Tecnicas_e_IA.docx
@@ -1878,6 +1878,176 @@
     <w:p>
       <w:r>
         <w:t xml:space="preserve">- Antes de renombrar cualquier archivo de vista en un proyecto Livewire/Laravel, vale la pena confirmar cómo se resuelve esa vista (por namespace lógico vs. por ruta literal) para saber si el rename es seguro sin tocar código adicional.</w:t>
+      </w:r>
+    </w:p>
+    <w:p/>
+    <w:p>
+      <w:r>
+        <w:t xml:space="preserve">---</w:t>
+      </w:r>
+    </w:p>
+    <w:p/>
+    <w:p>
+      <w:r>
+        <w:t xml:space="preserve">## Entrada — 22 de agosto de 2026</w:t>
+      </w:r>
+    </w:p>
+    <w:p>
+      <w:r>
+        <w:t xml:space="preserve">**Tema:** Nueva acción "Ver detalle y documentos" en la bandeja de Docencia, con el expediente académico del estudiante sumado al modal de detalle</w:t>
+      </w:r>
+    </w:p>
+    <w:p>
+      <w:r>
+        <w:t xml:space="preserve">**Participantes:** Equipo de desarrollo ISW-521</w:t>
+      </w:r>
+    </w:p>
+    <w:p>
+      <w:r>
+        <w:t xml:space="preserve">**Herramienta consultada:** Claude (Anthropic), vía Claude Code en terminal, con acceso al código del proyecto (sin entorno local levantado en esta sesión — ver sección 5)</w:t>
+      </w:r>
+    </w:p>
+    <w:p/>
+    <w:p>
+      <w:r>
+        <w:t xml:space="preserve">---</w:t>
+      </w:r>
+    </w:p>
+    <w:p/>
+    <w:p>
+      <w:r>
+        <w:t xml:space="preserve">### 1. Qué se le consultó a la IA</w:t>
+      </w:r>
+    </w:p>
+    <w:p/>
+    <w:p>
+      <w:r>
+        <w:t xml:space="preserve">Se pidió agregar, en las acciones de la bandeja de solicitudes de Docencia, una nueva acción llamada "Ver detalle y documentos" que, además de mostrar el detalle de la solicitud y sus documentos adjuntos, también mostrara el expediente del estudiante.</w:t>
+      </w:r>
+    </w:p>
+    <w:p/>
+    <w:p>
+      <w:r>
+        <w:t xml:space="preserve">### 2. Qué encontró la IA antes de actuar</w:t>
+      </w:r>
+    </w:p>
+    <w:p/>
+    <w:p>
+      <w:r>
+        <w:t xml:space="preserve">1. La bandeja de Docencia (`RequestComponent`/`request-component.blade.php`) ya tenía una acción "Ver" con un modal de solo lectura (`openViewModal`) que mostraba el detalle de la solicitud **y** los documentos adjuntos — es decir, dos de los tres requisitos ya existían, solo faltaba el nombre solicitado y el expediente.</w:t>
+      </w:r>
+    </w:p>
+    <w:p>
+      <w:r>
+        <w:t xml:space="preserve">2. El botón "Ver" se renderiza con `&lt;x-ui.row-actions&gt;`, un componente compartido por Roles, Permisos, Precedentes de Convalidación, Reglas de Levantamiento y el propio portal del estudiante — su título ("Ver") estaba fijo dentro del componente, así que cambiarlo directamente ahí habría renombrado el botón en las otras cinco pantallas sin que nadie lo pidiera.</w:t>
+      </w:r>
+    </w:p>
+    <w:p>
+      <w:r>
+        <w:t xml:space="preserve">3. El concepto de "expediente del estudiante" ya existía en el dominio, pero nunca se había mostrado en ninguna pantalla: `StudentAcademicProfileRepositoryInterface` (con el comentario propio "expediente simulado") lee la tabla `academic_records` (curso, estado, nota, período académico) exclusivamente para que el `WaiverEngine` responda preguntas sí/no de forma automática — ningún humano lo veía nunca directamente.</w:t>
+      </w:r>
+    </w:p>
+    <w:p>
+      <w:r>
+        <w:t xml:space="preserve">4. `StudentModel` ya tenía las relaciones `studyPlans()` (con el nivel actual vía pivote) y `academicRecords()` sin usar fuera del motor de reglas, así que no hacía falta construir infraestructura nueva para leer el expediente, solo cargarlas con `with()` y mapearlas a un arreglo para la vista, siguiendo el mismo patrón ya usado en `openViewModal()` para estudiantes/cursos/documentos.</w:t>
+      </w:r>
+    </w:p>
+    <w:p/>
+    <w:p>
+      <w:r>
+        <w:t xml:space="preserve">### 3. Qué se aceptó de la respuesta de la IA</w:t>
+      </w:r>
+    </w:p>
+    <w:p/>
+    <w:p>
+      <w:r>
+        <w:t xml:space="preserve">- Extender la acción y el modal "Ver" ya existentes en vez de crear una acción y un modal paralelos, ya que ambos requisitos (detalle + documentos) ya estaban resueltos ahí y compartían la misma autorización (`RequestPolicy::view()`, ya concedida a Docencia).</w:t>
+      </w:r>
+    </w:p>
+    <w:p>
+      <w:r>
+        <w:t xml:space="preserve">- Agregar un prop opcional `viewLabel` al componente compartido `&lt;x-ui.row-actions&gt;` (con `__('View')` como valor por defecto) para poder renombrar el botón únicamente en la bandeja de Docencia sin tocar Roles, Permisos, Precedentes, Reglas de Levantamiento ni el portal del estudiante.</w:t>
+      </w:r>
+    </w:p>
+    <w:p>
+      <w:r>
+        <w:t xml:space="preserve">- La nueva sección "Expediente del estudiante" dentro del modal existente: plan(es) de estudio con nivel actual, y el historial completo de `academic_records` (curso, estado con badge de color, nota, período), reutilizando `StudentModel::with(['studyPlans', 'academicRecords.course', 'academicRecords.academicPeriod'])` en vez de una consulta nueva por fuera del modelo ya existente.</w:t>
+      </w:r>
+    </w:p>
+    <w:p>
+      <w:r>
+        <w:t xml:space="preserve">- Las traducciones nuevas para los estados de `academic_records` que nunca se habían mostrado en una pantalla (`Failed` → "Reprobado", `Credited by Equivalence` → "Acreditado por equivalencia", `Credited by Validation` → "Acreditado por convalidación", `Requirement Waived` → "Requisito levantado").</w:t>
+      </w:r>
+    </w:p>
+    <w:p/>
+    <w:p>
+      <w:r>
+        <w:t xml:space="preserve">### 4. Qué se rechazó y por qué</w:t>
+      </w:r>
+    </w:p>
+    <w:p/>
+    <w:p>
+      <w:r>
+        <w:t xml:space="preserve">- No se reutilizó literalmente el estado `Approved` de una solicitud (`"Aprobada"`, femenino, concuerda con "solicitud") como si fuera nuevo para el estado de un curso aprobado en el expediente (que en buen español concordaría como "Aprobado", masculino, con "curso"). Se aceptó conscientemente esa pequeña imprecisión de género en vez de introducir una clave de traducción duplicada con el mismo texto en inglés (`"Approved"`) pero distinto valor en español, algo que Laravel no soporta con `lang/es.json` (una clave = un valor). Quedó señalado como un detalle cosmético menor, no como un error corregido a medias.</w:t>
+      </w:r>
+    </w:p>
+    <w:p>
+      <w:r>
+        <w:t xml:space="preserve">- No se tocó el permiso `requests.view` ni la policy: Docencia ya podía ver cualquier solicitud, así que no había nada que autorizar de nuevo para esta acción.</w:t>
+      </w:r>
+    </w:p>
+    <w:p>
+      <w:r>
+        <w:t xml:space="preserve">- No se creó una pantalla o ruta separada de "expediente del estudiante": el pedido fue mostrarlo junto al detalle y los documentos de la solicitud, no como una sección independiente del sistema.</w:t>
+      </w:r>
+    </w:p>
+    <w:p/>
+    <w:p>
+      <w:r>
+        <w:t xml:space="preserve">### 5. Qué hubo que corregir o verificar manualmente</w:t>
+      </w:r>
+    </w:p>
+    <w:p/>
+    <w:p>
+      <w:r>
+        <w:t xml:space="preserve">- El entorno de esta sesión no tenía `vendor/` ni `.env` configurados, así que la IA no pudo levantar la aplicación ni verificar el cambio abriendo el navegador con la cuenta de Docencia (`docencia@gmail.com`) — a diferencia de sesiones anteriores donde sí se verificó cada cambio en vivo. Se lo señaló explícitamente al equipo en la misma respuesta en vez de dar el cambio por probado, y quedó pendiente que el equipo lo confirme visualmente tras `composer install` + configurar `.env`.</w:t>
+      </w:r>
+    </w:p>
+    <w:p>
+      <w:r>
+        <w:t xml:space="preserve">- Ante la falta de un entorno ejecutable, se corrieron las validaciones estáticas disponibles: `php -l` sobre `RequestComponent.php`, y `json_decode()` sobre `lang/es.json` para confirmar que las claves nuevas no rompieran el archivo (no había ninguna clave duplicada con las ~230 ya existentes).</w:t>
+      </w:r>
+    </w:p>
+    <w:p>
+      <w:r>
+        <w:t xml:space="preserve">- Se revisó a mano el balance de directivas Blade (`@if`/`@else`/`@endif`/`@foreach`/`@endforeach`) en el bloque nuevo del modal, ya que no hay un linter de Blade disponible en este entorno para detectarlo automáticamente.</w:t>
+      </w:r>
+    </w:p>
+    <w:p/>
+    <w:p>
+      <w:r>
+        <w:t xml:space="preserve">### 6. Qué se aprendió del proceso</w:t>
+      </w:r>
+    </w:p>
+    <w:p/>
+    <w:p>
+      <w:r>
+        <w:t xml:space="preserve">- Antes de agregar una acción o pantalla nueva, vale la pena revisar si ya existe algo parecido a medio camino (aquí, el modal "Ver" ya cubría dos de los tres requisitos pedidos) — extenderlo evita duplicar autorización, consultas y markup que ya estaban resueltos y probados.</w:t>
+      </w:r>
+    </w:p>
+    <w:p>
+      <w:r>
+        <w:t xml:space="preserve">- Un componente de UI compartido por varias pantallas (`&lt;x-ui.row-actions&gt;`) no debe modificarse con un valor fijo nuevo solo porque una pantalla lo necesita — conviene volverlo configurable con un valor por defecto que preserve el comportamiento de todos los demás llamadores.</w:t>
+      </w:r>
+    </w:p>
+    <w:p>
+      <w:r>
+        <w:t xml:space="preserve">- Un concepto de dominio que ya existe pero solo se usa internamente (el "expediente simulado" que el motor de reglas consulta) puede tener ya toda la infraestructura de datos necesaria (modelos, relaciones) para exponerse en una pantalla — antes de diseñar algo nuevo vale la pena revisar si el dato que se pide ya se está leyendo en algún otro punto del sistema, aunque sea con otro propósito.</w:t>
+      </w:r>
+    </w:p>
+    <w:p>
+      <w:r>
+        <w:t xml:space="preserve">- Sin un entorno ejecutable, la verificación de un cambio de UI queda necesariamente incompleta (sintaxis sí, comportamiento real no) — es preferible decirlo con claridad en vez de dar a entender que el cambio fue probado igual que en sesiones con navegador disponible.</w:t>
       </w:r>
     </w:p>
     <w:p/>

</xml_diff>

<commit_message>
style(requests): widen the detail modal and align the record table to the data-row grid system
</commit_message>
<xml_diff>
--- a/Diario_de_Decisiones_Tecnicas_e_IA.docx
+++ b/Diario_de_Decisiones_Tecnicas_e_IA.docx
@@ -2048,6 +2048,343 @@
     <w:p>
       <w:r>
         <w:t xml:space="preserve">- Sin un entorno ejecutable, la verificación de un cambio de UI queda necesariamente incompleta (sintaxis sí, comportamiento real no) — es preferible decirlo con claridad en vez de dar a entender que el cambio fue probado igual que en sesiones con navegador disponible.</w:t>
+      </w:r>
+    </w:p>
+    <w:p/>
+    <w:p>
+      <w:r>
+        <w:t xml:space="preserve">---</w:t>
+      </w:r>
+    </w:p>
+    <w:p/>
+    <w:p>
+      <w:r>
+        <w:t xml:space="preserve">## Entrada — 22 de agosto de 2026 (continuación)</w:t>
+      </w:r>
+    </w:p>
+    <w:p>
+      <w:r>
+        <w:t xml:space="preserve">**Tema:** Encabezado del modal de detalle reorganizado + nueva sección "Cursos a convalidar" con Reconocer/No reconocer por curso</w:t>
+      </w:r>
+    </w:p>
+    <w:p>
+      <w:r>
+        <w:t xml:space="preserve">**Participantes:** Equipo de desarrollo ISW-521</w:t>
+      </w:r>
+    </w:p>
+    <w:p>
+      <w:r>
+        <w:t xml:space="preserve">**Herramienta consultada:** Claude (Anthropic), vía Claude Code en terminal, sin entorno local levantado en esta sesión</w:t>
+      </w:r>
+    </w:p>
+    <w:p/>
+    <w:p>
+      <w:r>
+        <w:t xml:space="preserve">---</w:t>
+      </w:r>
+    </w:p>
+    <w:p/>
+    <w:p>
+      <w:r>
+        <w:t xml:space="preserve">### 1. Qué se le consultó a la IA</w:t>
+      </w:r>
+    </w:p>
+    <w:p/>
+    <w:p>
+      <w:r>
+        <w:t xml:space="preserve">A partir de una referencia visual (mockup) compartida por el equipo, se pidieron dos cambios sobre el modal "Detalle de la solicitud" de Docencia:</w:t>
+      </w:r>
+    </w:p>
+    <w:p>
+      <w:r>
+        <w:t xml:space="preserve">1. Mover el badge de estado (hoy al final del modal, sección "Estado") a la cabecera, junto al título, y reordenar el cuerpo para que curso UTN + curso externo + universidad de procedencia aparezcan primero.</w:t>
+      </w:r>
+    </w:p>
+    <w:p>
+      <w:r>
+        <w:t xml:space="preserve">2. Agregar una sección "Cursos a convalidar" (solo para tipo Convalidación) con columnas Curso UTN/curso externo/universidad/código/créditos/resolución, un botón "Guardar datos externos", un campo de razón obligatorio solo para "No reconocer", y botones "Reconocer"/"No reconocer" por curso.</w:t>
+      </w:r>
+    </w:p>
+    <w:p/>
+    <w:p>
+      <w:r>
+        <w:t xml:space="preserve">El equipo señaló explícitamente, en su propio mensaje, que el punto 2 implicaba una decisión de modelo de dominio (¿sigue siendo 1 solicitud = 1 curso, o hace falta una entidad nueva tipo `RequestCourseLine` para agrupar varios cursos por solicitud?) que debía definirse antes de tocar código, no asumirse.</w:t>
+      </w:r>
+    </w:p>
+    <w:p/>
+    <w:p>
+      <w:r>
+        <w:t xml:space="preserve">### 2. Qué encontró la IA antes de actuar</w:t>
+      </w:r>
+    </w:p>
+    <w:p/>
+    <w:p>
+      <w:r>
+        <w:t xml:space="preserve">1. `&lt;x-ui.modal&gt;` es compartido por 6 pantallas distintas (Roles, Permisos, Precedentes, Reglas de Levantamiento, Crear solicitud, este modal), sin ningún slot para contenido extra en la cabecera — cualquier cambio ahí debía ser opt-in.</w:t>
+      </w:r>
+    </w:p>
+    <w:p>
+      <w:r>
+        <w:t xml:space="preserve">2. El dominio `Request` sigue siendo 1 solicitud = 1 curso externo, sin concepto de "envío"/lote que agrupe varias solicitudes creadas juntas.</w:t>
+      </w:r>
+    </w:p>
+    <w:p>
+      <w:r>
+        <w:t xml:space="preserve">3. Revisando el propio diario, la IA encontró que el 21 de agosto el equipo ya había decidido explícitamente **no** crear un agregado de dominio compartido ("Resolución") para agrupar los cursos de una misma convalidación — cada curso genera su propia `Request` independiente. Dos de las tres opciones que el propio equipo planteaba en su mensaje (agrupar Requests hermanas, o crear `RequestCourseLine`) reabrían esa decisión ya cerrada. En vez de elegir una por su cuenta o ignorar el precedente, la IA presentó las tres opciones al equipo citando explícitamente esa decisión previa como contexto.</w:t>
+      </w:r>
+    </w:p>
+    <w:p/>
+    <w:p>
+      <w:r>
+        <w:t xml:space="preserve">### 3. Qué se aceptó de la respuesta de la IA</w:t>
+      </w:r>
+    </w:p>
+    <w:p/>
+    <w:p>
+      <w:r>
+        <w:t xml:space="preserve">El equipo escogió, ante las preguntas planteadas: (a) "1 fila = la propia Request" — sin cambio de dominio — y (b) "el resultado por curso es el mismo status que ya existe en Request". Con esas dos decisiones, se aceptó:</w:t>
+      </w:r>
+    </w:p>
+    <w:p>
+      <w:r>
+        <w:t xml:space="preserve">- Un slot opcional `titleExtra` en `&lt;x-ui.modal&gt;`, sin modificar el comportamiento de los otros 5 usos del componente.</w:t>
+      </w:r>
+    </w:p>
+    <w:p>
+      <w:r>
+        <w:t xml:space="preserve">- El reordenamiento del cuerpo (solo para Convalidación): curso UTN, curso externo, universidad, y luego estudiante/tipo.</w:t>
+      </w:r>
+    </w:p>
+    <w:p>
+      <w:r>
+        <w:t xml:space="preserve">- Dos columnas nuevas y nullable en `requests` (`external_course_code`, `external_course_credits`) vía migración puramente aditiva, y un `SaveExternalCourseDataUseCase` separado de `ChangeRequestStatusUseCase` — para que "guardar datos externos" nunca escriba una fila de cambio de estado ni dispare notificaciones.</w:t>
+      </w:r>
+    </w:p>
+    <w:p>
+      <w:r>
+        <w:t xml:space="preserve">- Reutilizar `changeStatus()` (con un parámetro `$status` opcional) para que los botones "Reconocer"/"No reconocer" disparen exactamente el mismo flujo que ya usaba el modal de revisión clásico: mismo comentario obligatorio al denegar, mismo historial, mismo correo de notificación.</w:t>
+      </w:r>
+    </w:p>
+    <w:p/>
+    <w:p>
+      <w:r>
+        <w:t xml:space="preserve">### 4. Qué se rechazó y por qué</w:t>
+      </w:r>
+    </w:p>
+    <w:p/>
+    <w:p>
+      <w:r>
+        <w:t xml:space="preserve">- No se creó ninguna entidad de dominio nueva ni un campo de resultado separado del `status` existente — ambas alternativas fueron descartadas por el propio equipo al responder las preguntas, en línea con la decisión arquitectónica ya tomada la sesión anterior.</w:t>
+      </w:r>
+    </w:p>
+    <w:p>
+      <w:r>
+        <w:t xml:space="preserve">- No se reutilizó la traducción existente `Approved` → "Aprobada" (femenino, concuerda con "solicitud") para el badge de "Resolución" de un curso — se prefirió agregar etiquetas dedicadas "Reconocido"/"No reconocido" en vez de forzar una concordancia de género incorrecta ("Aprobada" no concuerda con "curso").</w:t>
+      </w:r>
+    </w:p>
+    <w:p/>
+    <w:p>
+      <w:r>
+        <w:t xml:space="preserve">### 5. Qué hubo que corregir o verificar manualmente</w:t>
+      </w:r>
+    </w:p>
+    <w:p/>
+    <w:p>
+      <w:r>
+        <w:t xml:space="preserve">- Sin `vendor/` ni `.env` en este entorno, la IA no pudo levantar la aplicación ni probar el cambio en el navegador. Se limitó a validaciones estáticas: `php -l` sobre los 6 archivos PHP tocados, `json_decode` sobre `lang/es.json`, y conteo manual de directivas Blade (`@if`/`@endif`/`@foreach`/`@endforeach`) para confirmar que quedaran balanceadas, a falta de un linter de Blade disponible.</w:t>
+      </w:r>
+    </w:p>
+    <w:p>
+      <w:r>
+        <w:t xml:space="preserve">- Quedó pendiente que el equipo corra `php artisan migrate` y pruebe el flujo completo (guardar datos externos, reconocer, no reconocer sin razón para confirmar que bloquea) con la cuenta de Docencia antes de dar el cambio por cerrado.</w:t>
+      </w:r>
+    </w:p>
+    <w:p/>
+    <w:p>
+      <w:r>
+        <w:t xml:space="preserve">### 6. Qué se aprendió del proceso</w:t>
+      </w:r>
+    </w:p>
+    <w:p/>
+    <w:p>
+      <w:r>
+        <w:t xml:space="preserve">- Cuando una instrucción nueva del equipo choca con una decisión arquitectónica ya tomada y documentada en una sesión anterior, vale la pena citarla explícitamente al presentar las opciones — así el equipo decide con memoria completa del proyecto, en vez de reabrir sin saberlo una discusión que ya se había cerrado.</w:t>
+      </w:r>
+    </w:p>
+    <w:p>
+      <w:r>
+        <w:t xml:space="preserve">- Reutilizar el mismo método de cambio de estado (parametrizándolo) para dos puntos de entrada de UI distintos — el modal de revisión clásico y los botones inline de la nueva tabla de cursos — evita mantener dos caminos paralelos hacia el mismo efecto de dominio, con el riesgo de que diverjan con el tiempo.</w:t>
+      </w:r>
+    </w:p>
+    <w:p/>
+    <w:p>
+      <w:r>
+        <w:t xml:space="preserve">---</w:t>
+      </w:r>
+    </w:p>
+    <w:p/>
+    <w:p>
+      <w:r>
+        <w:t xml:space="preserve">## Entrada — 22 de agosto de 2026 (continuación 2)</w:t>
+      </w:r>
+    </w:p>
+    <w:p>
+      <w:r>
+        <w:t xml:space="preserve">**Tema:** Expediente del estudiante ampliado, dos estados de revisión intermedios de vuelta al enum, y subida de documentos desde Docencia</w:t>
+      </w:r>
+    </w:p>
+    <w:p>
+      <w:r>
+        <w:t xml:space="preserve">**Participantes:** Equipo de desarrollo ISW-521</w:t>
+      </w:r>
+    </w:p>
+    <w:p>
+      <w:r>
+        <w:t xml:space="preserve">**Herramienta consultada:** Claude (Anthropic), vía Claude Code en terminal, sin entorno local levantado en esta sesión</w:t>
+      </w:r>
+    </w:p>
+    <w:p/>
+    <w:p>
+      <w:r>
+        <w:t xml:space="preserve">---</w:t>
+      </w:r>
+    </w:p>
+    <w:p/>
+    <w:p>
+      <w:r>
+        <w:t xml:space="preserve">### 1. Qué se le consultó a la IA</w:t>
+      </w:r>
+    </w:p>
+    <w:p/>
+    <w:p>
+      <w:r>
+        <w:t xml:space="preserve">A partir de una segunda referencia visual, el equipo pidió en un mismo mensaje:</w:t>
+      </w:r>
+    </w:p>
+    <w:p>
+      <w:r>
+        <w:t xml:space="preserve">1. Ampliar la sección "Expediente del estudiante" (hoy una tabla simple de Curso/Período/Estado/Nota) con datos de identificación (nombre completo, cédula/carné, correo institucional, badge de matrícula activa/inactiva), datos de carrera (carrera actual, cuatrimestre, plan de estudios), un resumen estadístico (Aprobadas/Reprobadas/Acreditadas/Promedio/Créditos) y una tabla ampliada (agregando "Cuatrimestre del Plan" y "Cursado en"), todo dentro de un encabezado colapsable con contador y chevron.</w:t>
+      </w:r>
+    </w:p>
+    <w:p>
+      <w:r>
+        <w:t xml:space="preserve">2. Rediseñar el modal de revisión: la fecha estimada pasa a tener su propio botón "Guardar fecha", el estado deja de ser un `&lt;select&gt;` y pasa a ser botones (incluyendo un estado nuevo, "Verificada por Registro", y el regreso de "En revisión" — eliminado la sesión anterior por redundante), los documentos adjuntos cambian a un formato de dos líneas, y se agrega la posibilidad de subir un documento nuevo desde Docencia.</w:t>
+      </w:r>
+    </w:p>
+    <w:p/>
+    <w:p>
+      <w:r>
+        <w:t xml:space="preserve">El equipo marcó explícitamente que el estado nuevo y la subida de documentos eran cambios de dominio/infraestructura ("no solo de vista"), no una simple maquetación.</w:t>
+      </w:r>
+    </w:p>
+    <w:p/>
+    <w:p>
+      <w:r>
+        <w:t xml:space="preserve">### 2. Qué encontró la IA antes de actuar</w:t>
+      </w:r>
+    </w:p>
+    <w:p/>
+    <w:p>
+      <w:r>
+        <w:t xml:space="preserve">1. Para el expediente: `StudentModel`/`User` ya tenían cédula, correo y matrícula disponibles; `LevelModel::courses()` (mismo pivote `course_level` que ya usa `CourseModel::levels()`) permitía resolver "Cuatrimestre del Plan" sin ninguna consulta nueva a la base de datos, tal como el propio equipo había sugerido revisar.</w:t>
+      </w:r>
+    </w:p>
+    <w:p>
+      <w:r>
+        <w:t xml:space="preserve">2. Para el flujo de estados: la IA detectó una tensión directa con una decisión ya tomada — "En revisión" se había eliminado explícitamente el 21 de agosto por ser redundante con "Pendiente de revisión", y ahora se pedía de vuelta junto con un estado adicional. Además, el mockup de referencia no mostraba un botón "Aprobada", lo que el propio equipo interpretó como una posible señal de que ese estado debía calcularse automáticamente cuando todos los cursos de la tabla del cambio anterior quedaran "Reconocidos" — algo que dependía directamente de cómo había quedado resuelto el punto 2 de la entrada anterior (1 Request = 1 curso).</w:t>
+      </w:r>
+    </w:p>
+    <w:p>
+      <w:r>
+        <w:t xml:space="preserve">3. En vez de asumir una de las alternativas o implementar la subida de documentos sin confirmar alcance, la IA presentó ambas decisiones como preguntas explícitas al equipo antes de tocar el dominio.</w:t>
+      </w:r>
+    </w:p>
+    <w:p/>
+    <w:p>
+      <w:r>
+        <w:t xml:space="preserve">### 3. Qué se aceptó de la respuesta de la IA</w:t>
+      </w:r>
+    </w:p>
+    <w:p/>
+    <w:p>
+      <w:r>
+        <w:t xml:space="preserve">El equipo decidió (a) agregar los dos estados nuevos sin cálculo automático — "Aprobada" se mantiene manual — y (b) sí implementar la subida de documentos. Con eso, se aceptó:</w:t>
+      </w:r>
+    </w:p>
+    <w:p>
+      <w:r>
+        <w:t xml:space="preserve">- La extensión de `studentRecord()` con identificación, carrera/plan y un resumen agregado (conteos por status + promedio ponderado por créditos + créditos ganados/totales del plan, calculado en PHP a partir de datos ya cargados, sin tocar la base de datos), colapsada con Alpine (`x-data`/`x-show`) reutilizando la clase `.chevron-toggle` que ya existía para el menú lateral.</w:t>
+      </w:r>
+    </w:p>
+    <w:p>
+      <w:r>
+        <w:t xml:space="preserve">- Una migración puramente aditiva para los estados `In Review` y `Verified by Registro` (sin remapeo de datos, a diferencia de la migración que los había reducido la sesión anterior).</w:t>
+      </w:r>
+    </w:p>
+    <w:p>
+      <w:r>
+        <w:t xml:space="preserve">- Convertir el `&lt;select&gt;` de estado en 5 botones — los 4 del mockup más "Aprobada" — para no dejar sin forma manual de aprobar a las solicitudes de tipo Dispensa de requisito, que no pasan por la tabla de Reconocer/No reconocer del cambio anterior.</w:t>
+      </w:r>
+    </w:p>
+    <w:p>
+      <w:r>
+        <w:t xml:space="preserve">- Separar "Guardar fecha" en su propia acción (`AssignEstimatedResolutionDateUseCase`), para no ensuciar el historial de la solicitud con una fila de "cambio de estado" falsa cuando solo se corrige la fecha.</w:t>
+      </w:r>
+    </w:p>
+    <w:p>
+      <w:r>
+        <w:t xml:space="preserve">- La subida de documentos desde Docencia, reutilizando el mismo trait (`StoresRequestAttachments`) y el mismo repositorio (`RequestAttachmentRepositoryInterface`) que ya usan los formularios del estudiante, en vez de construir un mecanismo de almacenamiento paralelo.</w:t>
+      </w:r>
+    </w:p>
+    <w:p/>
+    <w:p>
+      <w:r>
+        <w:t xml:space="preserve">### 4. Qué se rechazó y por qué</w:t>
+      </w:r>
+    </w:p>
+    <w:p/>
+    <w:p>
+      <w:r>
+        <w:t xml:space="preserve">- No se creó el permiso nuevo (`requests.upload_document`) que el propio equipo sugirió como posible requisito para la subida de documentos — se reutilizó la habilidad `review` ya existente, razonando que cualquier rol autorizado a revisar una solicitud es exactamente el rol que debería poder adjuntarle documentos. Crear un permiso nuevo habría requerido cambios de seeder que la IA no podía verificar en este entorno sin base de datos disponible.</w:t>
+      </w:r>
+    </w:p>
+    <w:p>
+      <w:r>
+        <w:t xml:space="preserve">- No se quitó el botón "Aprobada" del selector de estado pese a que el mockup de referencia no lo mostraba — se dejó explícitamente para no romper el único camino manual de aprobación de Dispensa de requisito.</w:t>
+      </w:r>
+    </w:p>
+    <w:p/>
+    <w:p>
+      <w:r>
+        <w:t xml:space="preserve">### 5. Qué hubo que corregir o verificar manualmente</w:t>
+      </w:r>
+    </w:p>
+    <w:p/>
+    <w:p>
+      <w:r>
+        <w:t xml:space="preserve">- Mismas limitaciones que la entrada anterior: sin `vendor/`/`.env`, solo se pudo validar con `php -l` sobre los archivos PHP tocados y `json_decode` sobre las traducciones nuevas agregadas a `lang/es.json`.</w:t>
+      </w:r>
+    </w:p>
+    <w:p>
+      <w:r>
+        <w:t xml:space="preserve">- Se recontó a mano el balance de directivas Blade después de este cambio (`@if`/`@endif`: 17/17, `@foreach`/`@endforeach`: 7/7, `@error`/`@enderror`: 14/14) antes de darlo por completo, a falta de un linter de Blade en este entorno.</w:t>
+      </w:r>
+    </w:p>
+    <w:p/>
+    <w:p>
+      <w:r>
+        <w:t xml:space="preserve">### 6. Qué se aprendió del proceso</w:t>
+      </w:r>
+    </w:p>
+    <w:p/>
+    <w:p>
+      <w:r>
+        <w:t xml:space="preserve">- Cuando una decisión nueva reabre una decisión ya cerrada en una sesión anterior (aquí, resucitar "En revisión"), conviene señalarlo explícitamente como una tensión real con el historial del proyecto, en vez de implementarlo en silencio como si fuera la primera vez que se discute — el equipo necesita saber que está revirtiendo algo, no solo agregando algo nuevo.</w:t>
+      </w:r>
+    </w:p>
+    <w:p>
+      <w:r>
+        <w:t xml:space="preserve">- Un mockup de referencia no siempre cubre todos los flujos existentes: en este caso, el mockup solo mostraba el camino de Convalidación (con su tabla de cursos y Reconocer/No reconocer), sin considerar que Dispensa de requisito no tiene ese mecanismo alterno para llegar a "Aprobada". Antes de calcar un diseño de referencia al pie de la letra, vale la pena verificar que ningún camino funcional existente quede sin reemplazo.</w:t>
       </w:r>
     </w:p>
     <w:p/>

</xml_diff>

<commit_message>
feat(requests): match the review modal's status buttons to the reference — no Aprobada for Course Validation
</commit_message>
<xml_diff>
--- a/Diario_de_Decisiones_Tecnicas_e_IA.docx
+++ b/Diario_de_Decisiones_Tecnicas_e_IA.docx
@@ -2385,6 +2385,426 @@
     <w:p>
       <w:r>
         <w:t xml:space="preserve">- Un mockup de referencia no siempre cubre todos los flujos existentes: en este caso, el mockup solo mostraba el camino de Convalidación (con su tabla de cursos y Reconocer/No reconocer), sin considerar que Dispensa de requisito no tiene ese mecanismo alterno para llegar a "Aprobada". Antes de calcar un diseño de referencia al pie de la letra, vale la pena verificar que ningún camino funcional existente quede sin reemplazo.</w:t>
+      </w:r>
+    </w:p>
+    <w:p/>
+    <w:p>
+      <w:r>
+        <w:t xml:space="preserve">---</w:t>
+      </w:r>
+    </w:p>
+    <w:p/>
+    <w:p>
+      <w:r>
+        <w:t xml:space="preserve">## Entrada — 22 de agosto de 2026 (continuación 3)</w:t>
+      </w:r>
+    </w:p>
+    <w:p>
+      <w:r>
+        <w:t xml:space="preserve">**Tema:** Separar la descarga de documentos adjuntos en vista previa y descarga forzada, a partir de un bug real encontrado por el equipo</w:t>
+      </w:r>
+    </w:p>
+    <w:p>
+      <w:r>
+        <w:t xml:space="preserve">**Participantes:** Equipo de desarrollo ISW-521</w:t>
+      </w:r>
+    </w:p>
+    <w:p>
+      <w:r>
+        <w:t xml:space="preserve">**Herramienta consultada:** Claude (Anthropic), vía Claude Code en terminal, sin entorno local levantado en esta sesión</w:t>
+      </w:r>
+    </w:p>
+    <w:p/>
+    <w:p>
+      <w:r>
+        <w:t xml:space="preserve">---</w:t>
+      </w:r>
+    </w:p>
+    <w:p/>
+    <w:p>
+      <w:r>
+        <w:t xml:space="preserve">### 1. Qué se le consultó a la IA</w:t>
+      </w:r>
+    </w:p>
+    <w:p/>
+    <w:p>
+      <w:r>
+        <w:t xml:space="preserve">El equipo, revisando `app/Http/Controllers/RequestAttachmentDownloadController.php`, encontró que su llamada a `RequestEntity::reconstitute()` no incluía el argumento `waiverJustification` y pidió agregar esa línea exacta. Poco después, en un mensaje separado con instrucciones de código detalladas, pidió dividir esa misma descarga en dos acciones — `preview()` (el navegador muestra el archivo directamente) y `download()` (fuerza guardar, el comportamiento original) — compartiendo la misma lógica de resolución y autorización, y reemplazar el bloque "Attached documents" del modal de detalle por dos botones (Vista previa/Descargar) en vez de un solo enlace.</w:t>
+      </w:r>
+    </w:p>
+    <w:p/>
+    <w:p>
+      <w:r>
+        <w:t xml:space="preserve">### 2. Qué encontró la IA antes de actuar</w:t>
+      </w:r>
+    </w:p>
+    <w:p/>
+    <w:p>
+      <w:r>
+        <w:t xml:space="preserve">Confirmó que `waiverJustification` es un parámetro obligatorio (sin valor por defecto) en la firma de `Request::reconstitute()`, agregado en una sesión anterior sin actualizar este controlador — por lo que **cualquier** descarga de un documento adjunto, desde el lado de Docencia o del estudiante, fallaba con un error fatal de PHP por argumento faltante. No era un defecto cosmético: la ruta estaba completamente rota.</w:t>
+      </w:r>
+    </w:p>
+    <w:p/>
+    <w:p>
+      <w:r>
+        <w:t xml:space="preserve">### 3. Qué se aceptó de la respuesta de la IA</w:t>
+      </w:r>
+    </w:p>
+    <w:p/>
+    <w:p>
+      <w:r>
+        <w:t xml:space="preserve">La línea faltante, tal como la dio el equipo. Para la división preview/download: extraer la lógica compartida (resolver el archivo, confirmar que pertenece a un `Request`, autorizar contra `RequestPolicy::view()`) a un método privado `resolveFile()`, evitando duplicarla entre los dos métodos públicos nuevos. La ruta original mantuvo su nombre (`requests.request.attachment-download`), ahora apuntando a `download`; se agregó una ruta nueva `.../preview` → `preview`.</w:t>
+      </w:r>
+    </w:p>
+    <w:p/>
+    <w:p>
+      <w:r>
+        <w:t xml:space="preserve">### 4. Qué se rechazó y por qué</w:t>
+      </w:r>
+    </w:p>
+    <w:p/>
+    <w:p>
+      <w:r>
+        <w:t xml:space="preserve">No se usó una URL firmada para la vista previa — mismo razonamiento ya documentado en el controlador original: el archivo solo se enlaza desde una pantalla ya autorizada, así que no hay un caso real donde alguien no autenticado necesite ese link.</w:t>
+      </w:r>
+    </w:p>
+    <w:p/>
+    <w:p>
+      <w:r>
+        <w:t xml:space="preserve">### 5. Qué hubo que corregir o verificar manualmente</w:t>
+      </w:r>
+    </w:p>
+    <w:p/>
+    <w:p>
+      <w:r>
+        <w:t xml:space="preserve">`php -l` sobre el controlador y el archivo de rutas, y conteo manual de balance de directivas Blade en el bloque de adjuntos reemplazado — sin entorno ejecutable para probar la descarga/vista previa real en el navegador.</w:t>
+      </w:r>
+    </w:p>
+    <w:p/>
+    <w:p>
+      <w:r>
+        <w:t xml:space="preserve">### 6. Qué se aprendió del proceso</w:t>
+      </w:r>
+    </w:p>
+    <w:p/>
+    <w:p>
+      <w:r>
+        <w:t xml:space="preserve">Un parámetro nuevo agregado a un método de dominio con argumentos nombrados (`reconstitute()`) no rompe nada en tiempo de escritura si el editor no valida tipos — solo se manifiesta en tiempo de ejecución, y puede quedar invisible durante días si nadie ejercita exactamente esa ruta. Tras agregar un parámetro requerido a un método de reconstitución de dominio, vale la pena buscar (`grep`) todos los sitios que lo llaman, no solo los que se tocaron en la misma sesión que lo agregó.</w:t>
+      </w:r>
+    </w:p>
+    <w:p/>
+    <w:p>
+      <w:r>
+        <w:t xml:space="preserve">---</w:t>
+      </w:r>
+    </w:p>
+    <w:p/>
+    <w:p>
+      <w:r>
+        <w:t xml:space="preserve">## Entrada — 22 de agosto de 2026 (continuación 4)</w:t>
+      </w:r>
+    </w:p>
+    <w:p>
+      <w:r>
+        <w:t xml:space="preserve">**Tema:** Adjuntos visibles en el modal de revisión y rediseño de los botones de estado</w:t>
+      </w:r>
+    </w:p>
+    <w:p>
+      <w:r>
+        <w:t xml:space="preserve">**Participantes:** Equipo de desarrollo ISW-521</w:t>
+      </w:r>
+    </w:p>
+    <w:p>
+      <w:r>
+        <w:t xml:space="preserve">**Herramienta consultada:** Claude (Anthropic), vía Claude Code en terminal, sin entorno local levantado en esta sesión</w:t>
+      </w:r>
+    </w:p>
+    <w:p/>
+    <w:p>
+      <w:r>
+        <w:t xml:space="preserve">---</w:t>
+      </w:r>
+    </w:p>
+    <w:p/>
+    <w:p>
+      <w:r>
+        <w:t xml:space="preserve">### 1. Qué se le consultó a la IA</w:t>
+      </w:r>
+    </w:p>
+    <w:p/>
+    <w:p>
+      <w:r>
+        <w:t xml:space="preserve">El equipo entregó tres instrucciones sobre el modal de revisión ("Cambiar estado"): (1) restylear el selector de estado — el enum, la migración y los 5 botones ya estaban resueltos de una entrada anterior, solo faltaba cambiar los pills de `status-badge` por un toggle `btn-primary`/`btn-secondary`; (2) mostrar en este modal los documentos ya adjuntos a la solicitud (hoy solo visibles en el modal de detalle), reutilizando el mismo bloque de vista previa/descarga recién creado; y (3) subir el límite de tamaño de la subida de documentos de Docencia a 10MB.</w:t>
+      </w:r>
+    </w:p>
+    <w:p/>
+    <w:p>
+      <w:r>
+        <w:t xml:space="preserve">### 2. Qué encontró la IA antes de actuar</w:t>
+      </w:r>
+    </w:p>
+    <w:p/>
+    <w:p>
+      <w:r>
+        <w:t xml:space="preserve">Verificó que la primera instrucción ya estaba resuelta salvo el estilo visual del botón. Para los adjuntos, confirmó que `openReviewModal()` nunca cargaba la lista de documentos (solo el formulario de subida), y que la consulta para traerla ya existía duplicada dentro de `openViewModal()`. Para el límite de tamaño, revisó los dos patrones de validación de archivos ya existentes en el proyecto (`RequestForm`: `mimes:pdf,jpg,jpeg,png` en 5MB y 10MB según el formulario) y confirmó que ninguno acepta Word/Excel, pese a que el mensaje del equipo daba a entender que sí.</w:t>
+      </w:r>
+    </w:p>
+    <w:p/>
+    <w:p>
+      <w:r>
+        <w:t xml:space="preserve">### 3. Qué se aceptó de la respuesta de la IA</w:t>
+      </w:r>
+    </w:p>
+    <w:p/>
+    <w:p>
+      <w:r>
+        <w:t xml:space="preserve">Restylear los botones de estado a `btn-primary`/`btn-secondary`. Extraer la consulta de documentos a un método compartido `documentsFor()`, usado ahora por `openViewModal()`, `openReviewModal()` y `uploadReviewDocument()` (para refrescar la lista tras subir uno nuevo), evitando que dos copias de la misma consulta diverjan con el tiempo. Subir el límite a 10MB, alineado con el límite más generoso que ya existía en el formulario de convalidación del estudiante, en vez de mantenerlo en 5MB o inventar un tercer límite.</w:t>
+      </w:r>
+    </w:p>
+    <w:p/>
+    <w:p>
+      <w:r>
+        <w:t xml:space="preserve">### 4. Qué se rechazó y por qué</w:t>
+      </w:r>
+    </w:p>
+    <w:p/>
+    <w:p>
+      <w:r>
+        <w:t xml:space="preserve">No se agregaron tipos MIME adicionales (Word/Excel) como sugería el mensaje del equipo — al no existir ese patrón en ningún formulario real del proyecto, agregarlo aquí habría introducido una tercera regla de validación inconsistente sin que el equipo lo confirmara explícitamente con ese detalle.</w:t>
+      </w:r>
+    </w:p>
+    <w:p/>
+    <w:p>
+      <w:r>
+        <w:t xml:space="preserve">### 5. Qué hubo que corregir o verificar manualmente</w:t>
+      </w:r>
+    </w:p>
+    <w:p/>
+    <w:p>
+      <w:r>
+        <w:t xml:space="preserve">`php -l` sobre `RequestComponent.php`, `json_decode` sobre las traducciones nuevas, y conteo de balance de directivas Blade (`@if`/`@endif`: 18/18, `@foreach`/`@endforeach`: 8/8) — sin poder probar el flujo real en el navegador.</w:t>
+      </w:r>
+    </w:p>
+    <w:p/>
+    <w:p>
+      <w:r>
+        <w:t xml:space="preserve">### 6. Qué se aprendió del proceso</w:t>
+      </w:r>
+    </w:p>
+    <w:p/>
+    <w:p>
+      <w:r>
+        <w:t xml:space="preserve">Cuando el mismo dato (aquí, la lista de documentos de una solicitud) se necesita en más de un lugar de la interfaz, conviene extraerlo a un método compartido apenas aparece la segunda necesidad, en vez de esperar una tercera copia que lo justifique — la primera duplicación ya es la señal. Antes de ampliar una validación siguiendo una instrucción que asume que cierto comportamiento "ya existe" en el código, vale la pena confirmarlo contra el código real en vez de asumir que la premisa es correcta.</w:t>
+      </w:r>
+    </w:p>
+    <w:p/>
+    <w:p>
+      <w:r>
+        <w:t xml:space="preserve">---</w:t>
+      </w:r>
+    </w:p>
+    <w:p/>
+    <w:p>
+      <w:r>
+        <w:t xml:space="preserve">## Entrada — 22 de agosto de 2026 (continuación 5)</w:t>
+      </w:r>
+    </w:p>
+    <w:p>
+      <w:r>
+        <w:t xml:space="preserve">**Tema:** Historial de estados y stepper de avance en el modal de detalle</w:t>
+      </w:r>
+    </w:p>
+    <w:p>
+      <w:r>
+        <w:t xml:space="preserve">**Participantes:** Equipo de desarrollo ISW-521</w:t>
+      </w:r>
+    </w:p>
+    <w:p>
+      <w:r>
+        <w:t xml:space="preserve">**Herramienta consultada:** Claude (Anthropic), vía Claude Code en terminal, sin entorno local levantado en esta sesión</w:t>
+      </w:r>
+    </w:p>
+    <w:p/>
+    <w:p>
+      <w:r>
+        <w:t xml:space="preserve">---</w:t>
+      </w:r>
+    </w:p>
+    <w:p/>
+    <w:p>
+      <w:r>
+        <w:t xml:space="preserve">### 1. Qué se le consultó a la IA</w:t>
+      </w:r>
+    </w:p>
+    <w:p/>
+    <w:p>
+      <w:r>
+        <w:t xml:space="preserve">El equipo señaló que la tabla `request_status_history` y su modelo ya existían, y que cada cambio de estado ya se registraba automáticamente en `ChangeRequestStatusUseCase::handle()` (estado anterior, estado nuevo, comentario, usuario, fecha) — pero nunca se mostraba en ninguna pantalla. Pidió agregarlo al modal de detalle con un formato específico por entrada, marcando explícitamente como pendiente de decisión del equipo si además había que crear una fila inicial de historial en `CreateRequestUseCase` (algo que hoy no existe). Por separado, pidió un stepper visual de 3 pasos (Recibida / En trámite / Aprobada-o-Denegada) derivado del `status`, señalando también como decisión abierta si el tercer paso debía tener una etiqueta fija ("Resuelta") o dinámica según el resultado.</w:t>
+      </w:r>
+    </w:p>
+    <w:p/>
+    <w:p>
+      <w:r>
+        <w:t xml:space="preserve">### 2. Qué encontró la IA antes de actuar</w:t>
+      </w:r>
+    </w:p>
+    <w:p/>
+    <w:p>
+      <w:r>
+        <w:t xml:space="preserve">Confirmó el modelo `RequestStatusHistoryModel` y su relación `user()`. Para el stepper, verificó que las variables CSS que el equipo asumía que existían (`--positive`, `--pending`) en realidad no existen como tales en `app.css` — el sistema de diseño solo define clases (`.status-badge.positive`, etc.) respaldadas por otros nombres de variable (`--badgeCustomText` para verde, `--actionDeleteText` para rojo, `--actionEditText` para ámbar), así que hubo que mapear a los tokens reales en vez de usar los nombres literales que el equipo propuso.</w:t>
+      </w:r>
+    </w:p>
+    <w:p/>
+    <w:p>
+      <w:r>
+        <w:t xml:space="preserve">### 3. Qué se aceptó de la respuesta de la IA</w:t>
+      </w:r>
+    </w:p>
+    <w:p/>
+    <w:p>
+      <w:r>
+        <w:t xml:space="preserve">La consulta de historial (`statusHistoryFor()`), mostrada con el formato pedido (estado anterior → estado nuevo, badge de quién lo cambió o "Sistema", fecha, comentario aparte). El stepper de 3 pasos, con "En trámite" cumplido si el estado actual no es el inicial o si ya existe algún registro de historial (las dos condiciones que el equipo ofreció como alternativas, combinadas con "o"). Y, tras preguntarlo explícitamente al equipo con una pregunta directa, la etiqueta dinámica ("Aprobada"/"Denegada" con color) para el tercer paso, en vez de una etiqueta fija neutra.</w:t>
+      </w:r>
+    </w:p>
+    <w:p/>
+    <w:p>
+      <w:r>
+        <w:t xml:space="preserve">### 4. Qué se rechazó y por qué</w:t>
+      </w:r>
+    </w:p>
+    <w:p/>
+    <w:p>
+      <w:r>
+        <w:t xml:space="preserve">No se tocó `CreateRequestUseCase` para generar la fila inicial de historial que el mockup de referencia mostraba — el equipo lo marcó explícitamente como una decisión pendiente, no como parte de esta instrucción. Hoy las solicitudes no muestran una entrada "(nueva) → Pendiente de revisión" en su historial, solo los cambios que Docencia ya hizo después de la creación.</w:t>
+      </w:r>
+    </w:p>
+    <w:p/>
+    <w:p>
+      <w:r>
+        <w:t xml:space="preserve">### 5. Qué hubo que corregir o verificar manualmente</w:t>
+      </w:r>
+    </w:p>
+    <w:p/>
+    <w:p>
+      <w:r>
+        <w:t xml:space="preserve">Mismas limitaciones de siempre en este entorno (sin `vendor/`/`.env`): `php -l`, `json_decode` sobre las traducciones nuevas, y conteo de balance de directivas Blade, que llegó a 20/20 (`@if`/`@endif`), 9/9 (`@foreach`/`@endforeach`) y 2/2 (`@php`/`@endphp`) tras este cambio.</w:t>
+      </w:r>
+    </w:p>
+    <w:p/>
+    <w:p>
+      <w:r>
+        <w:t xml:space="preserve">### 6. Qué se aprendió del proceso</w:t>
+      </w:r>
+    </w:p>
+    <w:p/>
+    <w:p>
+      <w:r>
+        <w:t xml:space="preserve">Cuando una instrucción asume la existencia de algo específico del sistema de diseño (aquí, variables CSS con nombres concretos), vale la pena verificarlo contra el CSS real antes de usarlo literalmente — el nombre de una clase (`.positive`) no siempre corresponde a una variable CSS del mismo nombre. Preguntar explícitamente por una decisión de diseño que el propio equipo marcó como abierta (el texto del tercer paso del stepper), en vez de elegir una opción "razonable" por su cuenta, evita tener que rehacer el trabajo si el equipo prefería la otra opción.</w:t>
+      </w:r>
+    </w:p>
+    <w:p/>
+    <w:p>
+      <w:r>
+        <w:t xml:space="preserve">---</w:t>
+      </w:r>
+    </w:p>
+    <w:p/>
+    <w:p>
+      <w:r>
+        <w:t xml:space="preserve">## Entrada — 22 de agosto de 2026 (continuación 6)</w:t>
+      </w:r>
+    </w:p>
+    <w:p>
+      <w:r>
+        <w:t xml:space="preserve">**Tema:** Botones de "Cambiar estado a" del modal de revisión — 4 sin "Aprobada" para Convalidación, 5 para Dispensa de requisito</w:t>
+      </w:r>
+    </w:p>
+    <w:p>
+      <w:r>
+        <w:t xml:space="preserve">**Participantes:** Equipo de desarrollo ISW-521</w:t>
+      </w:r>
+    </w:p>
+    <w:p>
+      <w:r>
+        <w:t xml:space="preserve">**Herramienta consultada:** Claude (Anthropic), vía Claude Code en terminal, sin entorno local levantado en esta sesión</w:t>
+      </w:r>
+    </w:p>
+    <w:p/>
+    <w:p>
+      <w:r>
+        <w:t xml:space="preserve">---</w:t>
+      </w:r>
+    </w:p>
+    <w:p/>
+    <w:p>
+      <w:r>
+        <w:t xml:space="preserve">### 1. Qué se le consultó a la IA</w:t>
+      </w:r>
+    </w:p>
+    <w:p/>
+    <w:p>
+      <w:r>
+        <w:t xml:space="preserve">El equipo mostró un recorte adicional de la referencia (con datos de ejemplo, incluyendo un archivo con nombre generado por IA) señalando "falta esta sección", sin precisar qué exactamente. Ante la pregunta de la IA, aclaró que se trataba del orden y la cantidad de los botones de "Cambiar estado a": la referencia muestra 4 (Pendiente de revisión, Verificada por Registro, En revisión, Denegada), sin "Aprobada" y en un orden distinto al que ya existía.</w:t>
+      </w:r>
+    </w:p>
+    <w:p/>
+    <w:p>
+      <w:r>
+        <w:t xml:space="preserve">### 2. Qué encontró la IA antes de actuar</w:t>
+      </w:r>
+    </w:p>
+    <w:p/>
+    <w:p>
+      <w:r>
+        <w:t xml:space="preserve">Antes de aplicar el cambio, señaló la consecuencia que tendría quitar "Aprobada" sin condición: las solicitudes de tipo Dispensa de requisito no tienen ninguna otra vía en la interfaz para llegar a ese estado (a diferencia de Convalidación, que ya puede hacerlo vía "Reconocer" en la tabla "Cursos a convalidar") — aplicar la referencia literalmente en ambos tipos habría dejado a Dispensa de requisito sin forma de aprobarse desde el modal.</w:t>
+      </w:r>
+    </w:p>
+    <w:p/>
+    <w:p>
+      <w:r>
+        <w:t xml:space="preserve">### 3. Qué se aceptó de la respuesta de la IA</w:t>
+      </w:r>
+    </w:p>
+    <w:p/>
+    <w:p>
+      <w:r>
+        <w:t xml:space="preserve">Mostrar los 4 botones de la referencia (sin "Aprobada", en su orden exacto) solo para solicitudes de tipo Convalidación, y mantener los 5 (con "Aprobada" al final, antes de "Denegada") para Dispensa de requisito — la opción que la IA recomendó al plantear la pregunta. Esto requirió agregar `$reviewingType` (poblado en `openReviewModal()` desde `$request-&gt;type()`) para que la vista supiera qué lista de botones renderizar.</w:t>
+      </w:r>
+    </w:p>
+    <w:p/>
+    <w:p>
+      <w:r>
+        <w:t xml:space="preserve">### 4. Qué se rechazó y por qué</w:t>
+      </w:r>
+    </w:p>
+    <w:p/>
+    <w:p>
+      <w:r>
+        <w:t xml:space="preserve">No se quitó "Aprobada" de forma universal como mostraba la referencia al pie de la letra — se habría roto la única vía manual de aprobación para Dispensa de requisito, y el equipo, ante la pregunta explícita, prefirió la versión condicional en vez de aceptar esa regresión funcional.</w:t>
+      </w:r>
+    </w:p>
+    <w:p/>
+    <w:p>
+      <w:r>
+        <w:t xml:space="preserve">### 5. Qué hubo que corregir o verificar manualmente</w:t>
+      </w:r>
+    </w:p>
+    <w:p/>
+    <w:p>
+      <w:r>
+        <w:t xml:space="preserve">`php -l` y conteo de balance de directivas Blade (`@if`/`@endif`: 20/20, `@foreach`/`@endforeach`: 9/9) — sin poder confirmar visualmente en el navegador que cada tipo de solicitud muestra el conjunto de botones correcto.</w:t>
+      </w:r>
+    </w:p>
+    <w:p/>
+    <w:p>
+      <w:r>
+        <w:t xml:space="preserve">### 6. Qué se aprendió del proceso</w:t>
+      </w:r>
+    </w:p>
+    <w:p/>
+    <w:p>
+      <w:r>
+        <w:t xml:space="preserve">Una instrucción de "hacer que coincida con la referencia" no siempre puede aplicarse literalmente si la referencia solo muestra un caso (aquí, una solicitud de Convalidación) y el sistema real tiene más de un flujo (Convalidación y Dispensa de requisito) compartiendo la misma pantalla. Antes de aplicar un cambio visual que quita una opción, vale la pena verificar si esa opción es la única vía funcional para algún caso de uso, en vez de asumir que "menos botones" es simplemente una mejora visual sin costo.</w:t>
       </w:r>
     </w:p>
     <w:p/>

</xml_diff>

<commit_message>
refactor(requests): merge the review modal into the detail modal
</commit_message>
<xml_diff>
--- a/Diario_de_Decisiones_Tecnicas_e_IA.docx
+++ b/Diario_de_Decisiones_Tecnicas_e_IA.docx
@@ -2805,6 +2805,111 @@
     <w:p>
       <w:r>
         <w:t xml:space="preserve">Una instrucción de "hacer que coincida con la referencia" no siempre puede aplicarse literalmente si la referencia solo muestra un caso (aquí, una solicitud de Convalidación) y el sistema real tiene más de un flujo (Convalidación y Dispensa de requisito) compartiendo la misma pantalla. Antes de aplicar un cambio visual que quita una opción, vale la pena verificar si esa opción es la única vía funcional para algún caso de uso, en vez de asumir que "menos botones" es simplemente una mejora visual sin costo.</w:t>
+      </w:r>
+    </w:p>
+    <w:p/>
+    <w:p>
+      <w:r>
+        <w:t xml:space="preserve">---</w:t>
+      </w:r>
+    </w:p>
+    <w:p/>
+    <w:p>
+      <w:r>
+        <w:t xml:space="preserve">## Entrada — 22 de agosto de 2026 (continuación 7)</w:t>
+      </w:r>
+    </w:p>
+    <w:p>
+      <w:r>
+        <w:t xml:space="preserve">**Tema:** Fusionar el modal "Review request" dentro de "Request detail" — un solo modal en vez de dos</w:t>
+      </w:r>
+    </w:p>
+    <w:p>
+      <w:r>
+        <w:t xml:space="preserve">**Participantes:** Equipo de desarrollo ISW-521</w:t>
+      </w:r>
+    </w:p>
+    <w:p>
+      <w:r>
+        <w:t xml:space="preserve">**Herramienta consultada:** Claude (Anthropic), vía Claude Code en terminal</w:t>
+      </w:r>
+    </w:p>
+    <w:p/>
+    <w:p>
+      <w:r>
+        <w:t xml:space="preserve">---</w:t>
+      </w:r>
+    </w:p>
+    <w:p/>
+    <w:p>
+      <w:r>
+        <w:t xml:space="preserve">### 1. Qué se le consultó a la IA</w:t>
+      </w:r>
+    </w:p>
+    <w:p/>
+    <w:p>
+      <w:r>
+        <w:t xml:space="preserve">Tras varias rondas de ajustes al modal de revisión, el equipo — ya probando la aplicación en su propio entorno — mostró una captura del modal "Request detail" preguntando por qué no veía ciertos botones. Ante la pregunta de la IA para precisar cuáles, el equipo definió directamente lo que quería en vez de seguir aclarando el malentendido puntual: "ya sé qué quiero hacer, fusiona ambos y que funcionen como uno mismo, entonces agrega lo que hay en edit al view" — unificar el modal "Review request" (botones de estado, fecha estimada, comentario, subida de documentos) dentro de "Request detail", eliminando el segundo modal.</w:t>
+      </w:r>
+    </w:p>
+    <w:p/>
+    <w:p>
+      <w:r>
+        <w:t xml:space="preserve">### 2. Qué encontró la IA antes de actuar</w:t>
+      </w:r>
+    </w:p>
+    <w:p/>
+    <w:p>
+      <w:r>
+        <w:t xml:space="preserve">Al planear la fusión, notó que el diseño anterior tenía un flujo de dos pasos para cambiar de estado: el botón de cada estado solo fijaba la propiedad `reviewStatus`; un botón "Confirmar" en el pie del modal de revisión, separado, era el que realmente llamaba a `changeStatus()`. El modal fusionado no conservaría ese pie de "Confirmar" propio — si se copiaba el markup del selector de estado tal cual, los botones habrían quedado sin ningún efecto real (fijarían la propiedad pero nunca la aplicarían).</w:t>
+      </w:r>
+    </w:p>
+    <w:p/>
+    <w:p>
+      <w:r>
+        <w:t xml:space="preserve">### 3. Qué se aceptó de la respuesta de la IA</w:t>
+      </w:r>
+    </w:p>
+    <w:p/>
+    <w:p>
+      <w:r>
+        <w:t xml:space="preserve">Que cada botón de estado llame directamente a `changeStatus('X')` al hacer clic, aplicando el cambio de inmediato — el mismo patrón de un solo clic que ya usan Reconocer/No reconocer en la misma pantalla, en vez de mantener un paso de confirmación separado que ya no tenía dónde vivir. Se eliminaron `showReviewModal`, `openReviewModal()`, `closeReviewModal()`, `reviewPrecedentResolution` y `reviewingDocuments` (todo duplicado o redundante tras la fusión), y `openViewModal()` pasó a ser el único lugar que inicializa el estado de revisión (estado, fecha, comentario, tipo/archivo de documento). Se quitó también el ícono de lápiz ("Editar") de la bandeja, dejando solo el de "Ver detalle y documentos" como única acción de entrada.</w:t>
+      </w:r>
+    </w:p>
+    <w:p/>
+    <w:p>
+      <w:r>
+        <w:t xml:space="preserve">### 4. Qué se rechazó y por qué</w:t>
+      </w:r>
+    </w:p>
+    <w:p/>
+    <w:p>
+      <w:r>
+        <w:t xml:space="preserve">No se intentó preservar un paso de "Confirmar" independiente (por ejemplo, agregando un botón fijo al final del modal fusionado) — se prefirió consistencia total con el patrón de un solo clic que Reconocer/No reconocer ya habían establecido en la misma pantalla, evitando que convivieran dos formas distintas de aplicar un cambio de estado en un mismo modal.</w:t>
+      </w:r>
+    </w:p>
+    <w:p/>
+    <w:p>
+      <w:r>
+        <w:t xml:space="preserve">### 5. Qué hubo que corregir o verificar manualmente</w:t>
+      </w:r>
+    </w:p>
+    <w:p/>
+    <w:p>
+      <w:r>
+        <w:t xml:space="preserve">`php -l`, y conteo de balance de directivas Blade tras la fusión (`@if`/`@endif`: 22/22, `@foreach`/`@endforeach`: 8/8, `@error`/`@enderror`: 14/14, `@php`/`@endphp`: 2/2) — sin poder confirmar visualmente en el navegador que el flujo completo (clic en un botón de estado, guardar fecha, subir documento) funciona correctamente de punta a punta en este entorno.</w:t>
+      </w:r>
+    </w:p>
+    <w:p/>
+    <w:p>
+      <w:r>
+        <w:t xml:space="preserve">### 6. Qué se aprendió del proceso</w:t>
+      </w:r>
+    </w:p>
+    <w:p/>
+    <w:p>
+      <w:r>
+        <w:t xml:space="preserve">Al fusionar dos pantallas que antes tenían flujos de interacción distintos (una de dos pasos con confirmación aparte, otra de un clic), hay que revisar explícitamente si alguna de las dos piezas dependía de una estructura que la fusión elimina (aquí, el botón "Confirmar" del pie del modal que desaparece) — copiar el markup sin ese análisis habría dejado un control visualmente presente pero funcionalmente muerto. Cuando el equipo interrumpe una pregunta de aclaración con una decisión ya tomada ("ya sé qué quiero hacer"), conviene ejecutar esa decisión directamente en vez de insistir en resolver primero la ambigüedad original, que quedó superada por la nueva instrucción.</w:t>
       </w:r>
     </w:p>
     <w:p/>

</xml_diff>

<commit_message>
fix(migrations): actually fix the status CHECK constraint on SQLite
</commit_message>
<xml_diff>
--- a/Diario_de_Decisiones_Tecnicas_e_IA.docx
+++ b/Diario_de_Decisiones_Tecnicas_e_IA.docx
@@ -2910,6 +2910,111 @@
     <w:p>
       <w:r>
         <w:t xml:space="preserve">Al fusionar dos pantallas que antes tenían flujos de interacción distintos (una de dos pasos con confirmación aparte, otra de un clic), hay que revisar explícitamente si alguna de las dos piezas dependía de una estructura que la fusión elimina (aquí, el botón "Confirmar" del pie del modal que desaparece) — copiar el markup sin ese análisis habría dejado un control visualmente presente pero funcionalmente muerto. Cuando el equipo interrumpe una pregunta de aclaración con una decisión ya tomada ("ya sé qué quiero hacer"), conviene ejecutar esa decisión directamente en vez de insistir en resolver primero la ambigüedad original, que quedó superada por la nueva instrucción.</w:t>
+      </w:r>
+    </w:p>
+    <w:p/>
+    <w:p>
+      <w:r>
+        <w:t xml:space="preserve">---</w:t>
+      </w:r>
+    </w:p>
+    <w:p/>
+    <w:p>
+      <w:r>
+        <w:t xml:space="preserve">## Entrada — 22 de agosto de 2026 (continuación 8)</w:t>
+      </w:r>
+    </w:p>
+    <w:p>
+      <w:r>
+        <w:t xml:space="preserve">**Tema:** El enum de `status` nunca se actualizó de verdad en SQLite — las dos migraciones anteriores solo evitaban el error de sintaxis, no arreglaban la restricción real</w:t>
+      </w:r>
+    </w:p>
+    <w:p>
+      <w:r>
+        <w:t xml:space="preserve">**Participantes:** Equipo de desarrollo ISW-521</w:t>
+      </w:r>
+    </w:p>
+    <w:p>
+      <w:r>
+        <w:t xml:space="preserve">**Herramienta consultada:** Claude (Anthropic), vía Claude Code en terminal, con el equipo probando en su propio entorno local (SQLite)</w:t>
+      </w:r>
+    </w:p>
+    <w:p/>
+    <w:p>
+      <w:r>
+        <w:t xml:space="preserve">---</w:t>
+      </w:r>
+    </w:p>
+    <w:p/>
+    <w:p>
+      <w:r>
+        <w:t xml:space="preserve">### 1. Qué se le consultó a la IA</w:t>
+      </w:r>
+    </w:p>
+    <w:p/>
+    <w:p>
+      <w:r>
+        <w:t xml:space="preserve">Al hacer clic en "Verificada por Registro" en el modal ya fusionado, el equipo reportó un `Illuminate\Database\QueryException`. La primera captura mostraba `no such column: external_course_code` — resuelto corriendo `php artisan migrate` (las migraciones del día no se habían aplicado). Al reintentar, apareció un segundo error distinto: `SQLSTATE[23000]: Integrity constraint violation: 19 CHECK constraint failed: status`, ya con `php artisan migrate:status` confirmando que las cuatro migraciones relevantes (incluida la que agrega `In Review`/`Verified by Registro` al enum) figuraban como "Ran".</w:t>
+      </w:r>
+    </w:p>
+    <w:p/>
+    <w:p>
+      <w:r>
+        <w:t xml:space="preserve">### 2. Qué encontró la IA antes de actuar</w:t>
+      </w:r>
+    </w:p>
+    <w:p/>
+    <w:p>
+      <w:r>
+        <w:t xml:space="preserve">Revisando las dos migraciones que tocan el enum de `status` (`2026_08_21_194439` y `2026_08_22_190000`), confirmó que ambas usan SQL crudo (`ALTER TABLE requests MODIFY status ENUM(...)`) — sintaxis exclusiva de MySQL — envuelto en `if (driver !== 'sqlite') { ... }`. Ese guard, agregado en una sesión anterior precisamente para no romper con un error de sintaxis en SQLite, tuvo un efecto secundario no previsto entonces: en SQLite el `ALTER` simplemente nunca se ejecuta, así que la restricción CHECK que SQLite usa para emular `enum()` se quedó exactamente como la dejó la migración de creación de la tabla (`2026_08_07_100008`), sin `Verified by Registro` (y, en su momento, sin `In Review` una vez que se había quitado). Es decir: las migraciones "corrieron" (aparecen como Ran) pero en SQLite no cambiaron nada.</w:t>
+      </w:r>
+    </w:p>
+    <w:p/>
+    <w:p>
+      <w:r>
+        <w:t xml:space="preserve">### 3. Qué se aceptó de la respuesta de la IA</w:t>
+      </w:r>
+    </w:p>
+    <w:p/>
+    <w:p>
+      <w:r>
+        <w:t xml:space="preserve">Una migración nueva (no se editaron las dos anteriores, ya aplicadas) que usa `Blueprint::enum('status', [...])-&gt;change()` — la API fluida de Laravel, que el propio framework traduce correctamente por motor (en MySQL genera el `ALTER MODIFY` equivalente; en SQLite reconstruye la tabla completa con la nueva restricción CHECK) — en vez de seguir escribiendo SQL crudo por motor. Reemplaza definitivamente el patrón de "SQL crudo + guard por driver" que había quedado corto.</w:t>
+      </w:r>
+    </w:p>
+    <w:p/>
+    <w:p>
+      <w:r>
+        <w:t xml:space="preserve">### 4. Qué se rechazó y por qué</w:t>
+      </w:r>
+    </w:p>
+    <w:p/>
+    <w:p>
+      <w:r>
+        <w:t xml:space="preserve">No se editaron las migraciones `2026_08_21_194439` ni `2026_08_22_190000` para "arreglarlas" — ya están marcadas como ejecutadas en las bases de datos existentes (la del equipo incluida), así que modificarlas no las volvería a correr; el único camino correcto en Laravel es una migración nueva que corrija el estado actual, no una edición retroactiva de una migración ya aplicada.</w:t>
+      </w:r>
+    </w:p>
+    <w:p/>
+    <w:p>
+      <w:r>
+        <w:t xml:space="preserve">### 5. Qué hubo que corregir o verificar manualmente</w:t>
+      </w:r>
+    </w:p>
+    <w:p/>
+    <w:p>
+      <w:r>
+        <w:t xml:space="preserve">`php -l` sobre la migración nueva. No fue posible ejecutar `php artisan migrate` en este entorno (sin `vendor/`) para confirmar que `Blueprint::change()` efectivamente reconstruye la tabla en SQLite sin requerir `doctrine/dbal` (no está en `composer.json`) — quedó pendiente que el equipo la corra y confirme, ya que es la única verificación real posible con la versión de Laravel de este proyecto.</w:t>
+      </w:r>
+    </w:p>
+    <w:p/>
+    <w:p>
+      <w:r>
+        <w:t xml:space="preserve">### 6. Qué se aprendió del proceso</w:t>
+      </w:r>
+    </w:p>
+    <w:p/>
+    <w:p>
+      <w:r>
+        <w:t xml:space="preserve">Un guard `if (driver !== 'sqlite')` alrededor de SQL crudo evita el error de sintaxis inmediato, pero no es lo mismo que "la migración funciona en SQLite" — sencillamente no hace nada ahí, y ese vacío solo se manifiesta más tarde, en el primer intento de escribir un valor que el guard nunca llegó a habilitar. La lección de fondo, ya aprendida una vez con el bug del `MODIFY` en la entrada del 21 de agosto y repetida aquí: cuando una migración necesita tocar un enum/CHECK constraint de forma que funcione en más de un motor de base de datos, la API fluida de Laravel (`change()`) es la herramienta correcta desde el principio — el SQL crudo por motor es lo que obliga a ir parchando driver por driver cada vez que aparece un caso nuevo.</w:t>
       </w:r>
     </w:p>
     <w:p/>

</xml_diff>